<commit_message>
dizájn egész jól áll
</commit_message>
<xml_diff>
--- a/Év eleji beugró feladat.docx
+++ b/Év eleji beugró feladat.docx
@@ -3453,21 +3453,43 @@
       <w:r>
         <w:rPr>
           <w:rFonts w:ascii="Times New Roman" w:hAnsi="Times New Roman" w:cs="Times New Roman"/>
-        </w:rPr>
-        <w:t>□ Létezik az index.html</w:t>
-      </w:r>
-    </w:p>
-    <w:p>
-      <w:pPr>
-        <w:rPr>
-          <w:rFonts w:ascii="Times New Roman" w:hAnsi="Times New Roman" w:cs="Times New Roman"/>
-        </w:rPr>
-      </w:pPr>
-      <w:r>
-        <w:rPr>
-          <w:rFonts w:ascii="Times New Roman" w:hAnsi="Times New Roman" w:cs="Times New Roman"/>
-        </w:rPr>
-        <w:t xml:space="preserve">□ Létezik a </w:t>
+          <w:color w:val="000000" w:themeColor="text1"/>
+          <w:highlight w:val="green"/>
+        </w:rPr>
+        <w:t>□</w:t>
+      </w:r>
+      <w:r>
+        <w:rPr>
+          <w:rFonts w:ascii="Times New Roman" w:hAnsi="Times New Roman" w:cs="Times New Roman"/>
+          <w:color w:val="000000" w:themeColor="text1"/>
+        </w:rPr>
+        <w:t xml:space="preserve"> </w:t>
+      </w:r>
+      <w:r>
+        <w:rPr>
+          <w:rFonts w:ascii="Times New Roman" w:hAnsi="Times New Roman" w:cs="Times New Roman"/>
+        </w:rPr>
+        <w:t>Létezik az index.html</w:t>
+      </w:r>
+    </w:p>
+    <w:p>
+      <w:pPr>
+        <w:rPr>
+          <w:rFonts w:ascii="Times New Roman" w:hAnsi="Times New Roman" w:cs="Times New Roman"/>
+        </w:rPr>
+      </w:pPr>
+      <w:r>
+        <w:rPr>
+          <w:rFonts w:ascii="Times New Roman" w:hAnsi="Times New Roman" w:cs="Times New Roman"/>
+          <w:highlight w:val="green"/>
+        </w:rPr>
+        <w:t>□</w:t>
+      </w:r>
+      <w:r>
+        <w:rPr>
+          <w:rFonts w:ascii="Times New Roman" w:hAnsi="Times New Roman" w:cs="Times New Roman"/>
+        </w:rPr>
+        <w:t xml:space="preserve"> Létezik a </w:t>
       </w:r>
       <w:proofErr w:type="spellStart"/>
       <w:r>
@@ -3493,8 +3515,15 @@
       <w:r>
         <w:rPr>
           <w:rFonts w:ascii="Times New Roman" w:hAnsi="Times New Roman" w:cs="Times New Roman"/>
-        </w:rPr>
-        <w:t xml:space="preserve">□ A képek az </w:t>
+          <w:highlight w:val="green"/>
+        </w:rPr>
+        <w:t>□</w:t>
+      </w:r>
+      <w:r>
+        <w:rPr>
+          <w:rFonts w:ascii="Times New Roman" w:hAnsi="Times New Roman" w:cs="Times New Roman"/>
+        </w:rPr>
+        <w:t xml:space="preserve"> A képek az </w:t>
       </w:r>
       <w:proofErr w:type="spellStart"/>
       <w:r>
@@ -3520,8 +3549,15 @@
       <w:r>
         <w:rPr>
           <w:rFonts w:ascii="Times New Roman" w:hAnsi="Times New Roman" w:cs="Times New Roman"/>
-        </w:rPr>
-        <w:t>□ A CSS megfelelően be van linkelve</w:t>
+          <w:highlight w:val="green"/>
+        </w:rPr>
+        <w:t>□</w:t>
+      </w:r>
+      <w:r>
+        <w:rPr>
+          <w:rFonts w:ascii="Times New Roman" w:hAnsi="Times New Roman" w:cs="Times New Roman"/>
+        </w:rPr>
+        <w:t xml:space="preserve"> A CSS megfelelően be van linkelve</w:t>
       </w:r>
     </w:p>
     <w:p>
@@ -3565,21 +3601,35 @@
       <w:r>
         <w:rPr>
           <w:rFonts w:ascii="Times New Roman" w:hAnsi="Times New Roman" w:cs="Times New Roman"/>
-        </w:rPr>
-        <w:t>□ Használtam HTML5 dokumentumtípust</w:t>
-      </w:r>
-    </w:p>
-    <w:p>
-      <w:pPr>
-        <w:rPr>
-          <w:rFonts w:ascii="Times New Roman" w:hAnsi="Times New Roman" w:cs="Times New Roman"/>
-        </w:rPr>
-      </w:pPr>
-      <w:r>
-        <w:rPr>
-          <w:rFonts w:ascii="Times New Roman" w:hAnsi="Times New Roman" w:cs="Times New Roman"/>
-        </w:rPr>
-        <w:t>□ Beállítottam a magyar nyelvet (</w:t>
+          <w:highlight w:val="green"/>
+        </w:rPr>
+        <w:t>□</w:t>
+      </w:r>
+      <w:r>
+        <w:rPr>
+          <w:rFonts w:ascii="Times New Roman" w:hAnsi="Times New Roman" w:cs="Times New Roman"/>
+        </w:rPr>
+        <w:t xml:space="preserve"> Használtam HTML5 dokumentumtípust</w:t>
+      </w:r>
+    </w:p>
+    <w:p>
+      <w:pPr>
+        <w:rPr>
+          <w:rFonts w:ascii="Times New Roman" w:hAnsi="Times New Roman" w:cs="Times New Roman"/>
+        </w:rPr>
+      </w:pPr>
+      <w:r>
+        <w:rPr>
+          <w:rFonts w:ascii="Times New Roman" w:hAnsi="Times New Roman" w:cs="Times New Roman"/>
+          <w:highlight w:val="green"/>
+        </w:rPr>
+        <w:t>□</w:t>
+      </w:r>
+      <w:r>
+        <w:rPr>
+          <w:rFonts w:ascii="Times New Roman" w:hAnsi="Times New Roman" w:cs="Times New Roman"/>
+        </w:rPr>
+        <w:t xml:space="preserve"> Beállítottam a magyar nyelvet (</w:t>
       </w:r>
       <w:proofErr w:type="spellStart"/>
       <w:r>
@@ -3605,8 +3655,15 @@
       <w:r>
         <w:rPr>
           <w:rFonts w:ascii="Times New Roman" w:hAnsi="Times New Roman" w:cs="Times New Roman"/>
-        </w:rPr>
-        <w:t>□ Van &lt;</w:t>
+          <w:highlight w:val="green"/>
+        </w:rPr>
+        <w:t>□</w:t>
+      </w:r>
+      <w:r>
+        <w:rPr>
+          <w:rFonts w:ascii="Times New Roman" w:hAnsi="Times New Roman" w:cs="Times New Roman"/>
+        </w:rPr>
+        <w:t xml:space="preserve"> Van &lt;</w:t>
       </w:r>
       <w:proofErr w:type="spellStart"/>
       <w:r>
@@ -3632,8 +3689,15 @@
       <w:r>
         <w:rPr>
           <w:rFonts w:ascii="Times New Roman" w:hAnsi="Times New Roman" w:cs="Times New Roman"/>
-        </w:rPr>
-        <w:t>□ Van &lt;</w:t>
+          <w:highlight w:val="green"/>
+        </w:rPr>
+        <w:t>□</w:t>
+      </w:r>
+      <w:r>
+        <w:rPr>
+          <w:rFonts w:ascii="Times New Roman" w:hAnsi="Times New Roman" w:cs="Times New Roman"/>
+        </w:rPr>
+        <w:t xml:space="preserve"> Van &lt;</w:t>
       </w:r>
       <w:proofErr w:type="spellStart"/>
       <w:r>
@@ -3659,21 +3723,35 @@
       <w:r>
         <w:rPr>
           <w:rFonts w:ascii="Times New Roman" w:hAnsi="Times New Roman" w:cs="Times New Roman"/>
-        </w:rPr>
-        <w:t>□ Van &lt;main&gt; elem</w:t>
-      </w:r>
-    </w:p>
-    <w:p>
-      <w:pPr>
-        <w:rPr>
-          <w:rFonts w:ascii="Times New Roman" w:hAnsi="Times New Roman" w:cs="Times New Roman"/>
-        </w:rPr>
-      </w:pPr>
-      <w:r>
-        <w:rPr>
-          <w:rFonts w:ascii="Times New Roman" w:hAnsi="Times New Roman" w:cs="Times New Roman"/>
-        </w:rPr>
-        <w:t>□ Van legalább 4 &lt;</w:t>
+          <w:highlight w:val="green"/>
+        </w:rPr>
+        <w:t>□</w:t>
+      </w:r>
+      <w:r>
+        <w:rPr>
+          <w:rFonts w:ascii="Times New Roman" w:hAnsi="Times New Roman" w:cs="Times New Roman"/>
+        </w:rPr>
+        <w:t xml:space="preserve"> Van &lt;main&gt; elem</w:t>
+      </w:r>
+    </w:p>
+    <w:p>
+      <w:pPr>
+        <w:rPr>
+          <w:rFonts w:ascii="Times New Roman" w:hAnsi="Times New Roman" w:cs="Times New Roman"/>
+        </w:rPr>
+      </w:pPr>
+      <w:r>
+        <w:rPr>
+          <w:rFonts w:ascii="Times New Roman" w:hAnsi="Times New Roman" w:cs="Times New Roman"/>
+          <w:highlight w:val="green"/>
+        </w:rPr>
+        <w:t xml:space="preserve">□ </w:t>
+      </w:r>
+      <w:r>
+        <w:rPr>
+          <w:rFonts w:ascii="Times New Roman" w:hAnsi="Times New Roman" w:cs="Times New Roman"/>
+        </w:rPr>
+        <w:t>Van legalább 4 &lt;</w:t>
       </w:r>
       <w:proofErr w:type="spellStart"/>
       <w:r>
@@ -3699,8 +3777,15 @@
       <w:r>
         <w:rPr>
           <w:rFonts w:ascii="Times New Roman" w:hAnsi="Times New Roman" w:cs="Times New Roman"/>
-        </w:rPr>
-        <w:t>□ Van &lt;</w:t>
+          <w:highlight w:val="green"/>
+        </w:rPr>
+        <w:t>□</w:t>
+      </w:r>
+      <w:r>
+        <w:rPr>
+          <w:rFonts w:ascii="Times New Roman" w:hAnsi="Times New Roman" w:cs="Times New Roman"/>
+        </w:rPr>
+        <w:t xml:space="preserve"> Van &lt;</w:t>
       </w:r>
       <w:proofErr w:type="spellStart"/>
       <w:r>
@@ -3739,8 +3824,15 @@
       <w:r>
         <w:rPr>
           <w:rFonts w:ascii="Times New Roman" w:hAnsi="Times New Roman" w:cs="Times New Roman"/>
-        </w:rPr>
-        <w:t>□ A menüpontok a megfelelő szakaszokra mutatnak</w:t>
+          <w:highlight w:val="green"/>
+        </w:rPr>
+        <w:t>□</w:t>
+      </w:r>
+      <w:r>
+        <w:rPr>
+          <w:rFonts w:ascii="Times New Roman" w:hAnsi="Times New Roman" w:cs="Times New Roman"/>
+        </w:rPr>
+        <w:t xml:space="preserve"> A menüpontok a megfelelő szakaszokra mutatnak</w:t>
       </w:r>
     </w:p>
     <w:p>
@@ -3784,21 +3876,35 @@
       <w:r>
         <w:rPr>
           <w:rFonts w:ascii="Times New Roman" w:hAnsi="Times New Roman" w:cs="Times New Roman"/>
-        </w:rPr>
-        <w:t>□ Van név a fejlécben</w:t>
-      </w:r>
-    </w:p>
-    <w:p>
-      <w:pPr>
-        <w:rPr>
-          <w:rFonts w:ascii="Times New Roman" w:hAnsi="Times New Roman" w:cs="Times New Roman"/>
-        </w:rPr>
-      </w:pPr>
-      <w:r>
-        <w:rPr>
-          <w:rFonts w:ascii="Times New Roman" w:hAnsi="Times New Roman" w:cs="Times New Roman"/>
-        </w:rPr>
-        <w:t>□ Van mottó vagy foglalkozás</w:t>
+          <w:highlight w:val="green"/>
+        </w:rPr>
+        <w:t>□</w:t>
+      </w:r>
+      <w:r>
+        <w:rPr>
+          <w:rFonts w:ascii="Times New Roman" w:hAnsi="Times New Roman" w:cs="Times New Roman"/>
+        </w:rPr>
+        <w:t xml:space="preserve"> Van név a fejlécben</w:t>
+      </w:r>
+    </w:p>
+    <w:p>
+      <w:pPr>
+        <w:rPr>
+          <w:rFonts w:ascii="Times New Roman" w:hAnsi="Times New Roman" w:cs="Times New Roman"/>
+        </w:rPr>
+      </w:pPr>
+      <w:r>
+        <w:rPr>
+          <w:rFonts w:ascii="Times New Roman" w:hAnsi="Times New Roman" w:cs="Times New Roman"/>
+          <w:highlight w:val="green"/>
+        </w:rPr>
+        <w:t>□</w:t>
+      </w:r>
+      <w:r>
+        <w:rPr>
+          <w:rFonts w:ascii="Times New Roman" w:hAnsi="Times New Roman" w:cs="Times New Roman"/>
+        </w:rPr>
+        <w:t xml:space="preserve"> Van mottó vagy foglalkozás</w:t>
       </w:r>
     </w:p>
     <w:p>
@@ -3823,47 +3929,75 @@
       <w:r>
         <w:rPr>
           <w:rFonts w:ascii="Times New Roman" w:hAnsi="Times New Roman" w:cs="Times New Roman"/>
-        </w:rPr>
-        <w:t>□ Van legalább 6 készség</w:t>
-      </w:r>
-    </w:p>
-    <w:p>
-      <w:pPr>
-        <w:rPr>
-          <w:rFonts w:ascii="Times New Roman" w:hAnsi="Times New Roman" w:cs="Times New Roman"/>
-        </w:rPr>
-      </w:pPr>
-      <w:r>
-        <w:rPr>
-          <w:rFonts w:ascii="Times New Roman" w:hAnsi="Times New Roman" w:cs="Times New Roman"/>
-        </w:rPr>
-        <w:t>□ Van legalább 3 projekt</w:t>
-      </w:r>
-    </w:p>
-    <w:p>
-      <w:pPr>
-        <w:rPr>
-          <w:rFonts w:ascii="Times New Roman" w:hAnsi="Times New Roman" w:cs="Times New Roman"/>
-        </w:rPr>
-      </w:pPr>
-      <w:r>
-        <w:rPr>
-          <w:rFonts w:ascii="Times New Roman" w:hAnsi="Times New Roman" w:cs="Times New Roman"/>
-        </w:rPr>
-        <w:t>□ Van kapcsolati információ</w:t>
-      </w:r>
-    </w:p>
-    <w:p>
-      <w:pPr>
-        <w:rPr>
-          <w:rFonts w:ascii="Times New Roman" w:hAnsi="Times New Roman" w:cs="Times New Roman"/>
-        </w:rPr>
-      </w:pPr>
-      <w:r>
-        <w:rPr>
-          <w:rFonts w:ascii="Times New Roman" w:hAnsi="Times New Roman" w:cs="Times New Roman"/>
-        </w:rPr>
-        <w:t>□ Van lábléc</w:t>
+          <w:highlight w:val="green"/>
+        </w:rPr>
+        <w:t>□</w:t>
+      </w:r>
+      <w:r>
+        <w:rPr>
+          <w:rFonts w:ascii="Times New Roman" w:hAnsi="Times New Roman" w:cs="Times New Roman"/>
+        </w:rPr>
+        <w:t xml:space="preserve"> Van legalább 6 készség</w:t>
+      </w:r>
+    </w:p>
+    <w:p>
+      <w:pPr>
+        <w:rPr>
+          <w:rFonts w:ascii="Times New Roman" w:hAnsi="Times New Roman" w:cs="Times New Roman"/>
+        </w:rPr>
+      </w:pPr>
+      <w:r>
+        <w:rPr>
+          <w:rFonts w:ascii="Times New Roman" w:hAnsi="Times New Roman" w:cs="Times New Roman"/>
+          <w:highlight w:val="green"/>
+        </w:rPr>
+        <w:t>□</w:t>
+      </w:r>
+      <w:r>
+        <w:rPr>
+          <w:rFonts w:ascii="Times New Roman" w:hAnsi="Times New Roman" w:cs="Times New Roman"/>
+        </w:rPr>
+        <w:t xml:space="preserve"> Van legalább 3 projekt</w:t>
+      </w:r>
+    </w:p>
+    <w:p>
+      <w:pPr>
+        <w:rPr>
+          <w:rFonts w:ascii="Times New Roman" w:hAnsi="Times New Roman" w:cs="Times New Roman"/>
+        </w:rPr>
+      </w:pPr>
+      <w:r>
+        <w:rPr>
+          <w:rFonts w:ascii="Times New Roman" w:hAnsi="Times New Roman" w:cs="Times New Roman"/>
+          <w:highlight w:val="green"/>
+        </w:rPr>
+        <w:t>□</w:t>
+      </w:r>
+      <w:r>
+        <w:rPr>
+          <w:rFonts w:ascii="Times New Roman" w:hAnsi="Times New Roman" w:cs="Times New Roman"/>
+        </w:rPr>
+        <w:t xml:space="preserve"> Van kapcsolati információ</w:t>
+      </w:r>
+    </w:p>
+    <w:p>
+      <w:pPr>
+        <w:rPr>
+          <w:rFonts w:ascii="Times New Roman" w:hAnsi="Times New Roman" w:cs="Times New Roman"/>
+        </w:rPr>
+      </w:pPr>
+      <w:r>
+        <w:rPr>
+          <w:rFonts w:ascii="Times New Roman" w:hAnsi="Times New Roman" w:cs="Times New Roman"/>
+          <w:highlight w:val="green"/>
+        </w:rPr>
+        <w:t>□</w:t>
+      </w:r>
+      <w:r>
+        <w:rPr>
+          <w:rFonts w:ascii="Times New Roman" w:hAnsi="Times New Roman" w:cs="Times New Roman"/>
+        </w:rPr>
+        <w:t xml:space="preserve"> Van lábléc</w:t>
       </w:r>
     </w:p>
     <w:p>
@@ -3907,61 +4041,96 @@
       <w:r>
         <w:rPr>
           <w:rFonts w:ascii="Times New Roman" w:hAnsi="Times New Roman" w:cs="Times New Roman"/>
-        </w:rPr>
-        <w:t>□ Külső CSS fájlt használok</w:t>
-      </w:r>
-    </w:p>
-    <w:p>
-      <w:pPr>
-        <w:rPr>
-          <w:rFonts w:ascii="Times New Roman" w:hAnsi="Times New Roman" w:cs="Times New Roman"/>
-        </w:rPr>
-      </w:pPr>
-      <w:r>
-        <w:rPr>
-          <w:rFonts w:ascii="Times New Roman" w:hAnsi="Times New Roman" w:cs="Times New Roman"/>
+          <w:highlight w:val="green"/>
+        </w:rPr>
+        <w:t>□</w:t>
+      </w:r>
+      <w:r>
+        <w:rPr>
+          <w:rFonts w:ascii="Times New Roman" w:hAnsi="Times New Roman" w:cs="Times New Roman"/>
+        </w:rPr>
+        <w:t xml:space="preserve"> Külső CSS fájlt használok</w:t>
+      </w:r>
+    </w:p>
+    <w:p>
+      <w:pPr>
+        <w:rPr>
+          <w:rFonts w:ascii="Times New Roman" w:hAnsi="Times New Roman" w:cs="Times New Roman"/>
+        </w:rPr>
+      </w:pPr>
+      <w:r>
+        <w:rPr>
+          <w:rFonts w:ascii="Times New Roman" w:hAnsi="Times New Roman" w:cs="Times New Roman"/>
+          <w:highlight w:val="green"/>
         </w:rPr>
         <w:lastRenderedPageBreak/>
-        <w:t>□ Formáztam a betűtípust</w:t>
-      </w:r>
-    </w:p>
-    <w:p>
-      <w:pPr>
-        <w:rPr>
-          <w:rFonts w:ascii="Times New Roman" w:hAnsi="Times New Roman" w:cs="Times New Roman"/>
-        </w:rPr>
-      </w:pPr>
-      <w:r>
-        <w:rPr>
-          <w:rFonts w:ascii="Times New Roman" w:hAnsi="Times New Roman" w:cs="Times New Roman"/>
-        </w:rPr>
-        <w:t>□ Használtam színeket</w:t>
-      </w:r>
-    </w:p>
-    <w:p>
-      <w:pPr>
-        <w:rPr>
-          <w:rFonts w:ascii="Times New Roman" w:hAnsi="Times New Roman" w:cs="Times New Roman"/>
-        </w:rPr>
-      </w:pPr>
-      <w:r>
-        <w:rPr>
-          <w:rFonts w:ascii="Times New Roman" w:hAnsi="Times New Roman" w:cs="Times New Roman"/>
-        </w:rPr>
-        <w:t>□ Használtam margót (margin)</w:t>
-      </w:r>
-    </w:p>
-    <w:p>
-      <w:pPr>
-        <w:rPr>
-          <w:rFonts w:ascii="Times New Roman" w:hAnsi="Times New Roman" w:cs="Times New Roman"/>
-        </w:rPr>
-      </w:pPr>
-      <w:r>
-        <w:rPr>
-          <w:rFonts w:ascii="Times New Roman" w:hAnsi="Times New Roman" w:cs="Times New Roman"/>
-        </w:rPr>
-        <w:t>□ Használtam belső térközt (</w:t>
+        <w:t>□</w:t>
+      </w:r>
+      <w:r>
+        <w:rPr>
+          <w:rFonts w:ascii="Times New Roman" w:hAnsi="Times New Roman" w:cs="Times New Roman"/>
+        </w:rPr>
+        <w:t xml:space="preserve"> Formáztam a betűtípust</w:t>
+      </w:r>
+    </w:p>
+    <w:p>
+      <w:pPr>
+        <w:rPr>
+          <w:rFonts w:ascii="Times New Roman" w:hAnsi="Times New Roman" w:cs="Times New Roman"/>
+        </w:rPr>
+      </w:pPr>
+      <w:r>
+        <w:rPr>
+          <w:rFonts w:ascii="Times New Roman" w:hAnsi="Times New Roman" w:cs="Times New Roman"/>
+          <w:highlight w:val="green"/>
+        </w:rPr>
+        <w:t>□</w:t>
+      </w:r>
+      <w:r>
+        <w:rPr>
+          <w:rFonts w:ascii="Times New Roman" w:hAnsi="Times New Roman" w:cs="Times New Roman"/>
+        </w:rPr>
+        <w:t xml:space="preserve"> Használtam színeket</w:t>
+      </w:r>
+    </w:p>
+    <w:p>
+      <w:pPr>
+        <w:rPr>
+          <w:rFonts w:ascii="Times New Roman" w:hAnsi="Times New Roman" w:cs="Times New Roman"/>
+        </w:rPr>
+      </w:pPr>
+      <w:r>
+        <w:rPr>
+          <w:rFonts w:ascii="Times New Roman" w:hAnsi="Times New Roman" w:cs="Times New Roman"/>
+          <w:highlight w:val="green"/>
+        </w:rPr>
+        <w:t>□</w:t>
+      </w:r>
+      <w:r>
+        <w:rPr>
+          <w:rFonts w:ascii="Times New Roman" w:hAnsi="Times New Roman" w:cs="Times New Roman"/>
+        </w:rPr>
+        <w:t xml:space="preserve"> Használtam margót (margin)</w:t>
+      </w:r>
+    </w:p>
+    <w:p>
+      <w:pPr>
+        <w:rPr>
+          <w:rFonts w:ascii="Times New Roman" w:hAnsi="Times New Roman" w:cs="Times New Roman"/>
+        </w:rPr>
+      </w:pPr>
+      <w:r>
+        <w:rPr>
+          <w:rFonts w:ascii="Times New Roman" w:hAnsi="Times New Roman" w:cs="Times New Roman"/>
+          <w:highlight w:val="green"/>
+        </w:rPr>
+        <w:t>□</w:t>
+      </w:r>
+      <w:r>
+        <w:rPr>
+          <w:rFonts w:ascii="Times New Roman" w:hAnsi="Times New Roman" w:cs="Times New Roman"/>
+        </w:rPr>
+        <w:t xml:space="preserve"> Használtam belső térközt (</w:t>
       </w:r>
       <w:proofErr w:type="spellStart"/>
       <w:r>
@@ -8505,26 +8674,6 @@
 </file>
 
 <file path=customXml/item1.xml><?xml version="1.0" encoding="utf-8"?>
-<p:properties xmlns:p="http://schemas.microsoft.com/office/2006/metadata/properties" xmlns:xsi="http://www.w3.org/2001/XMLSchema-instance" xmlns:pc="http://schemas.microsoft.com/office/infopath/2007/PartnerControls">
-  <documentManagement>
-    <TaxCatchAll xmlns="a302d444-be9f-46f7-8d57-7fcd8dffb9f7" xsi:nil="true"/>
-    <lcf76f155ced4ddcb4097134ff3c332f xmlns="3b482ed9-8516-4b08-969d-6de7c18a37f1">
-      <Terms xmlns="http://schemas.microsoft.com/office/infopath/2007/PartnerControls"/>
-    </lcf76f155ced4ddcb4097134ff3c332f>
-  </documentManagement>
-</p:properties>
-</file>
-
-<file path=customXml/item2.xml><?xml version="1.0" encoding="utf-8"?>
-<?mso-contentType ?>
-<FormTemplates xmlns="http://schemas.microsoft.com/sharepoint/v3/contenttype/forms">
-  <Display>DocumentLibraryForm</Display>
-  <Edit>DocumentLibraryForm</Edit>
-  <New>DocumentLibraryForm</New>
-</FormTemplates>
-</file>
-
-<file path=customXml/item3.xml><?xml version="1.0" encoding="utf-8"?>
 <ct:contentTypeSchema xmlns:ct="http://schemas.microsoft.com/office/2006/metadata/contentType" xmlns:ma="http://schemas.microsoft.com/office/2006/metadata/properties/metaAttributes" ct:_="" ma:_="" ma:contentTypeName="Dokumentum" ma:contentTypeID="0x0101002368CE90E734094FB7639C254C9A1949" ma:contentTypeVersion="10" ma:contentTypeDescription="Új dokumentum létrehozása." ma:contentTypeScope="" ma:versionID="0287f0bf345ff42235d3221137ae4a83">
   <xsd:schema xmlns:xsd="http://www.w3.org/2001/XMLSchema" xmlns:xs="http://www.w3.org/2001/XMLSchema" xmlns:p="http://schemas.microsoft.com/office/2006/metadata/properties" xmlns:ns2="3b482ed9-8516-4b08-969d-6de7c18a37f1" xmlns:ns3="a302d444-be9f-46f7-8d57-7fcd8dffb9f7" targetNamespace="http://schemas.microsoft.com/office/2006/metadata/properties" ma:root="true" ma:fieldsID="9b7fb6852766fbf3443e90d18e386398" ns2:_="" ns3:_="">
     <xsd:import namespace="3b482ed9-8516-4b08-969d-6de7c18a37f1"/>
@@ -8713,32 +8862,27 @@
 </ct:contentTypeSchema>
 </file>
 
-<file path=customXml/itemProps1.xml><?xml version="1.0" encoding="utf-8"?>
-<ds:datastoreItem xmlns:ds="http://schemas.openxmlformats.org/officeDocument/2006/customXml" ds:itemID="{0B5B0B91-61F6-41CF-8237-5357FE3F0223}">
-  <ds:schemaRefs>
-    <ds:schemaRef ds:uri="3b482ed9-8516-4b08-969d-6de7c18a37f1"/>
-    <ds:schemaRef ds:uri="http://purl.org/dc/elements/1.1/"/>
-    <ds:schemaRef ds:uri="http://www.w3.org/XML/1998/namespace"/>
-    <ds:schemaRef ds:uri="http://schemas.microsoft.com/office/2006/documentManagement/types"/>
-    <ds:schemaRef ds:uri="http://purl.org/dc/dcmitype/"/>
-    <ds:schemaRef ds:uri="http://purl.org/dc/terms/"/>
-    <ds:schemaRef ds:uri="a302d444-be9f-46f7-8d57-7fcd8dffb9f7"/>
-    <ds:schemaRef ds:uri="http://schemas.microsoft.com/office/infopath/2007/PartnerControls"/>
-    <ds:schemaRef ds:uri="http://schemas.openxmlformats.org/package/2006/metadata/core-properties"/>
-    <ds:schemaRef ds:uri="http://schemas.microsoft.com/office/2006/metadata/properties"/>
-  </ds:schemaRefs>
-</ds:datastoreItem>
+<file path=customXml/item2.xml><?xml version="1.0" encoding="utf-8"?>
+<?mso-contentType ?>
+<FormTemplates xmlns="http://schemas.microsoft.com/sharepoint/v3/contenttype/forms">
+  <Display>DocumentLibraryForm</Display>
+  <Edit>DocumentLibraryForm</Edit>
+  <New>DocumentLibraryForm</New>
+</FormTemplates>
 </file>
 
-<file path=customXml/itemProps2.xml><?xml version="1.0" encoding="utf-8"?>
-<ds:datastoreItem xmlns:ds="http://schemas.openxmlformats.org/officeDocument/2006/customXml" ds:itemID="{8F6019E3-B2AB-458C-9CE0-D55AFBE67629}">
-  <ds:schemaRefs>
-    <ds:schemaRef ds:uri="http://schemas.microsoft.com/sharepoint/v3/contenttype/forms"/>
-  </ds:schemaRefs>
-</ds:datastoreItem>
+<file path=customXml/item3.xml><?xml version="1.0" encoding="utf-8"?>
+<p:properties xmlns:p="http://schemas.microsoft.com/office/2006/metadata/properties" xmlns:xsi="http://www.w3.org/2001/XMLSchema-instance" xmlns:pc="http://schemas.microsoft.com/office/infopath/2007/PartnerControls">
+  <documentManagement>
+    <TaxCatchAll xmlns="a302d444-be9f-46f7-8d57-7fcd8dffb9f7" xsi:nil="true"/>
+    <lcf76f155ced4ddcb4097134ff3c332f xmlns="3b482ed9-8516-4b08-969d-6de7c18a37f1">
+      <Terms xmlns="http://schemas.microsoft.com/office/infopath/2007/PartnerControls"/>
+    </lcf76f155ced4ddcb4097134ff3c332f>
+  </documentManagement>
+</p:properties>
 </file>
 
-<file path=customXml/itemProps3.xml><?xml version="1.0" encoding="utf-8"?>
+<file path=customXml/itemProps1.xml><?xml version="1.0" encoding="utf-8"?>
 <ds:datastoreItem xmlns:ds="http://schemas.openxmlformats.org/officeDocument/2006/customXml" ds:itemID="{27E92379-4415-4B95-B7D9-AF42F4120494}">
   <ds:schemaRefs>
     <ds:schemaRef ds:uri="http://schemas.microsoft.com/office/2006/metadata/contentType"/>
@@ -8755,4 +8899,23 @@
     <ds:schemaRef ds:uri="http://schemas.microsoft.com/internal/obd"/>
   </ds:schemaRefs>
 </ds:datastoreItem>
+</file>
+
+<file path=customXml/itemProps2.xml><?xml version="1.0" encoding="utf-8"?>
+<ds:datastoreItem xmlns:ds="http://schemas.openxmlformats.org/officeDocument/2006/customXml" ds:itemID="{8F6019E3-B2AB-458C-9CE0-D55AFBE67629}">
+  <ds:schemaRefs>
+    <ds:schemaRef ds:uri="http://schemas.microsoft.com/sharepoint/v3/contenttype/forms"/>
+  </ds:schemaRefs>
+</ds:datastoreItem>
+</file>
+
+<file path=customXml/itemProps3.xml><?xml version="1.0" encoding="utf-8"?>
+<ds:datastoreItem xmlns:ds="http://schemas.openxmlformats.org/officeDocument/2006/customXml" ds:itemID="{0B5B0B91-61F6-41CF-8237-5357FE3F0223}">
+  <ds:schemaRefs>
+    <ds:schemaRef ds:uri="http://schemas.microsoft.com/office/2006/metadata/properties"/>
+    <ds:schemaRef ds:uri="http://schemas.microsoft.com/office/infopath/2007/PartnerControls"/>
+    <ds:schemaRef ds:uri="a302d444-be9f-46f7-8d57-7fcd8dffb9f7"/>
+    <ds:schemaRef ds:uri="3b482ed9-8516-4b08-969d-6de7c18a37f1"/>
+  </ds:schemaRefs>
+</ds:datastoreItem>
 </file>
</xml_diff>

<commit_message>
elvileg minden kész, de nincs profilkép
</commit_message>
<xml_diff>
--- a/Év eleji beugró feladat.docx
+++ b/Év eleji beugró feladat.docx
@@ -3817,8 +3817,15 @@
       <w:r>
         <w:rPr>
           <w:rFonts w:ascii="Times New Roman" w:hAnsi="Times New Roman" w:cs="Times New Roman"/>
-        </w:rPr>
-        <w:t>□ Minden képhez tartozik alt attribútum</w:t>
+          <w:highlight w:val="green"/>
+        </w:rPr>
+        <w:t>□</w:t>
+      </w:r>
+      <w:r>
+        <w:rPr>
+          <w:rFonts w:ascii="Times New Roman" w:hAnsi="Times New Roman" w:cs="Times New Roman"/>
+        </w:rPr>
+        <w:t xml:space="preserve"> Minden képhez tartozik alt attribútum</w:t>
       </w:r>
     </w:p>
     <w:p>
@@ -3922,8 +3929,15 @@
       <w:r>
         <w:rPr>
           <w:rFonts w:ascii="Times New Roman" w:hAnsi="Times New Roman" w:cs="Times New Roman"/>
-        </w:rPr>
-        <w:t>□ Van bemutatkozó szöveg</w:t>
+          <w:highlight w:val="green"/>
+        </w:rPr>
+        <w:t>□</w:t>
+      </w:r>
+      <w:r>
+        <w:rPr>
+          <w:rFonts w:ascii="Times New Roman" w:hAnsi="Times New Roman" w:cs="Times New Roman"/>
+        </w:rPr>
+        <w:t xml:space="preserve"> Van bemutatkozó szöveg</w:t>
       </w:r>
     </w:p>
     <w:p>
@@ -4348,8 +4362,15 @@
       <w:r>
         <w:rPr>
           <w:rFonts w:ascii="Times New Roman" w:hAnsi="Times New Roman" w:cs="Times New Roman"/>
-        </w:rPr>
-        <w:t xml:space="preserve">□ Készítettem </w:t>
+          <w:highlight w:val="green"/>
+        </w:rPr>
+        <w:t>□</w:t>
+      </w:r>
+      <w:r>
+        <w:rPr>
+          <w:rFonts w:ascii="Times New Roman" w:hAnsi="Times New Roman" w:cs="Times New Roman"/>
+        </w:rPr>
+        <w:t xml:space="preserve"> Készítettem </w:t>
       </w:r>
       <w:proofErr w:type="spellStart"/>
       <w:r>
@@ -4383,8 +4404,15 @@
       <w:r>
         <w:rPr>
           <w:rFonts w:ascii="Times New Roman" w:hAnsi="Times New Roman" w:cs="Times New Roman"/>
-        </w:rPr>
-        <w:t xml:space="preserve">□ 800 </w:t>
+          <w:highlight w:val="green"/>
+        </w:rPr>
+        <w:t>□</w:t>
+      </w:r>
+      <w:r>
+        <w:rPr>
+          <w:rFonts w:ascii="Times New Roman" w:hAnsi="Times New Roman" w:cs="Times New Roman"/>
+        </w:rPr>
+        <w:t xml:space="preserve"> 800 </w:t>
       </w:r>
       <w:proofErr w:type="spellStart"/>
       <w:r>
@@ -4410,8 +4438,15 @@
       <w:r>
         <w:rPr>
           <w:rFonts w:ascii="Times New Roman" w:hAnsi="Times New Roman" w:cs="Times New Roman"/>
-        </w:rPr>
-        <w:t xml:space="preserve">□ 800 </w:t>
+          <w:highlight w:val="green"/>
+        </w:rPr>
+        <w:t>□</w:t>
+      </w:r>
+      <w:r>
+        <w:rPr>
+          <w:rFonts w:ascii="Times New Roman" w:hAnsi="Times New Roman" w:cs="Times New Roman"/>
+        </w:rPr>
+        <w:t xml:space="preserve"> 800 </w:t>
       </w:r>
       <w:proofErr w:type="spellStart"/>
       <w:r>
@@ -4437,8 +4472,15 @@
       <w:r>
         <w:rPr>
           <w:rFonts w:ascii="Times New Roman" w:hAnsi="Times New Roman" w:cs="Times New Roman"/>
-        </w:rPr>
-        <w:t xml:space="preserve">□ 800 </w:t>
+          <w:highlight w:val="green"/>
+        </w:rPr>
+        <w:t>□</w:t>
+      </w:r>
+      <w:r>
+        <w:rPr>
+          <w:rFonts w:ascii="Times New Roman" w:hAnsi="Times New Roman" w:cs="Times New Roman"/>
+        </w:rPr>
+        <w:t xml:space="preserve"> 800 </w:t>
       </w:r>
       <w:proofErr w:type="spellStart"/>
       <w:r>
@@ -4496,60 +4538,95 @@
       <w:r>
         <w:rPr>
           <w:rFonts w:ascii="Times New Roman" w:hAnsi="Times New Roman" w:cs="Times New Roman"/>
-        </w:rPr>
-        <w:t>□ Az oldal hibamentesen megnyílik böngészőben</w:t>
-      </w:r>
-    </w:p>
-    <w:p>
-      <w:pPr>
-        <w:rPr>
-          <w:rFonts w:ascii="Times New Roman" w:hAnsi="Times New Roman" w:cs="Times New Roman"/>
-        </w:rPr>
-      </w:pPr>
-      <w:r>
-        <w:rPr>
-          <w:rFonts w:ascii="Times New Roman" w:hAnsi="Times New Roman" w:cs="Times New Roman"/>
-        </w:rPr>
-        <w:t>□ Nem jelenik meg hiányzó kép ikon</w:t>
-      </w:r>
-    </w:p>
-    <w:p>
-      <w:pPr>
-        <w:rPr>
-          <w:rFonts w:ascii="Times New Roman" w:hAnsi="Times New Roman" w:cs="Times New Roman"/>
-        </w:rPr>
-      </w:pPr>
-      <w:r>
-        <w:rPr>
-          <w:rFonts w:ascii="Times New Roman" w:hAnsi="Times New Roman" w:cs="Times New Roman"/>
-        </w:rPr>
-        <w:t>□ A kód tagolt és olvasható</w:t>
-      </w:r>
-    </w:p>
-    <w:p>
-      <w:pPr>
-        <w:rPr>
-          <w:rFonts w:ascii="Times New Roman" w:hAnsi="Times New Roman" w:cs="Times New Roman"/>
-        </w:rPr>
-      </w:pPr>
-      <w:r>
-        <w:rPr>
-          <w:rFonts w:ascii="Times New Roman" w:hAnsi="Times New Roman" w:cs="Times New Roman"/>
-        </w:rPr>
-        <w:t>□ A fájlok nevei ékezetmentesek</w:t>
-      </w:r>
-    </w:p>
-    <w:p>
-      <w:pPr>
-        <w:rPr>
-          <w:rFonts w:ascii="Times New Roman" w:hAnsi="Times New Roman" w:cs="Times New Roman"/>
-        </w:rPr>
-      </w:pPr>
-      <w:r>
-        <w:rPr>
-          <w:rFonts w:ascii="Times New Roman" w:hAnsi="Times New Roman" w:cs="Times New Roman"/>
-        </w:rPr>
-        <w:t>□ A feladat minden pontját teljesítettem</w:t>
+          <w:highlight w:val="green"/>
+        </w:rPr>
+        <w:t>□</w:t>
+      </w:r>
+      <w:r>
+        <w:rPr>
+          <w:rFonts w:ascii="Times New Roman" w:hAnsi="Times New Roman" w:cs="Times New Roman"/>
+        </w:rPr>
+        <w:t xml:space="preserve"> Az oldal hibamentesen megnyílik böngészőben</w:t>
+      </w:r>
+    </w:p>
+    <w:p>
+      <w:pPr>
+        <w:rPr>
+          <w:rFonts w:ascii="Times New Roman" w:hAnsi="Times New Roman" w:cs="Times New Roman"/>
+        </w:rPr>
+      </w:pPr>
+      <w:r>
+        <w:rPr>
+          <w:rFonts w:ascii="Times New Roman" w:hAnsi="Times New Roman" w:cs="Times New Roman"/>
+          <w:highlight w:val="green"/>
+        </w:rPr>
+        <w:t>□</w:t>
+      </w:r>
+      <w:r>
+        <w:rPr>
+          <w:rFonts w:ascii="Times New Roman" w:hAnsi="Times New Roman" w:cs="Times New Roman"/>
+        </w:rPr>
+        <w:t xml:space="preserve"> Nem jelenik meg hiányzó kép ikon</w:t>
+      </w:r>
+    </w:p>
+    <w:p>
+      <w:pPr>
+        <w:rPr>
+          <w:rFonts w:ascii="Times New Roman" w:hAnsi="Times New Roman" w:cs="Times New Roman"/>
+        </w:rPr>
+      </w:pPr>
+      <w:r>
+        <w:rPr>
+          <w:rFonts w:ascii="Times New Roman" w:hAnsi="Times New Roman" w:cs="Times New Roman"/>
+          <w:highlight w:val="green"/>
+        </w:rPr>
+        <w:t>□</w:t>
+      </w:r>
+      <w:r>
+        <w:rPr>
+          <w:rFonts w:ascii="Times New Roman" w:hAnsi="Times New Roman" w:cs="Times New Roman"/>
+        </w:rPr>
+        <w:t xml:space="preserve"> A kód tagolt és olvasható</w:t>
+      </w:r>
+    </w:p>
+    <w:p>
+      <w:pPr>
+        <w:rPr>
+          <w:rFonts w:ascii="Times New Roman" w:hAnsi="Times New Roman" w:cs="Times New Roman"/>
+        </w:rPr>
+      </w:pPr>
+      <w:r>
+        <w:rPr>
+          <w:rFonts w:ascii="Times New Roman" w:hAnsi="Times New Roman" w:cs="Times New Roman"/>
+          <w:highlight w:val="green"/>
+        </w:rPr>
+        <w:t>□</w:t>
+      </w:r>
+      <w:r>
+        <w:rPr>
+          <w:rFonts w:ascii="Times New Roman" w:hAnsi="Times New Roman" w:cs="Times New Roman"/>
+        </w:rPr>
+        <w:t xml:space="preserve"> A fájlok nevei ékezetmentesek</w:t>
+      </w:r>
+    </w:p>
+    <w:p>
+      <w:pPr>
+        <w:rPr>
+          <w:rFonts w:ascii="Times New Roman" w:hAnsi="Times New Roman" w:cs="Times New Roman"/>
+        </w:rPr>
+      </w:pPr>
+      <w:r>
+        <w:rPr>
+          <w:rFonts w:ascii="Times New Roman" w:hAnsi="Times New Roman" w:cs="Times New Roman"/>
+          <w:highlight w:val="green"/>
+        </w:rPr>
+        <w:t>□</w:t>
+      </w:r>
+      <w:r>
+        <w:rPr>
+          <w:rFonts w:ascii="Times New Roman" w:hAnsi="Times New Roman" w:cs="Times New Roman"/>
+        </w:rPr>
+        <w:t xml:space="preserve"> A feladat minden pontját teljesítettem</w:t>
       </w:r>
     </w:p>
     <w:p>
@@ -8708,26 +8785,6 @@
 </file>
 
 <file path=customXml/item1.xml><?xml version="1.0" encoding="utf-8"?>
-<p:properties xmlns:p="http://schemas.microsoft.com/office/2006/metadata/properties" xmlns:xsi="http://www.w3.org/2001/XMLSchema-instance" xmlns:pc="http://schemas.microsoft.com/office/infopath/2007/PartnerControls">
-  <documentManagement>
-    <TaxCatchAll xmlns="a302d444-be9f-46f7-8d57-7fcd8dffb9f7" xsi:nil="true"/>
-    <lcf76f155ced4ddcb4097134ff3c332f xmlns="3b482ed9-8516-4b08-969d-6de7c18a37f1">
-      <Terms xmlns="http://schemas.microsoft.com/office/infopath/2007/PartnerControls"/>
-    </lcf76f155ced4ddcb4097134ff3c332f>
-  </documentManagement>
-</p:properties>
-</file>
-
-<file path=customXml/item2.xml><?xml version="1.0" encoding="utf-8"?>
-<?mso-contentType ?>
-<FormTemplates xmlns="http://schemas.microsoft.com/sharepoint/v3/contenttype/forms">
-  <Display>DocumentLibraryForm</Display>
-  <Edit>DocumentLibraryForm</Edit>
-  <New>DocumentLibraryForm</New>
-</FormTemplates>
-</file>
-
-<file path=customXml/item3.xml><?xml version="1.0" encoding="utf-8"?>
 <ct:contentTypeSchema xmlns:ct="http://schemas.microsoft.com/office/2006/metadata/contentType" xmlns:ma="http://schemas.microsoft.com/office/2006/metadata/properties/metaAttributes" ct:_="" ma:_="" ma:contentTypeName="Dokumentum" ma:contentTypeID="0x0101002368CE90E734094FB7639C254C9A1949" ma:contentTypeVersion="10" ma:contentTypeDescription="Új dokumentum létrehozása." ma:contentTypeScope="" ma:versionID="0287f0bf345ff42235d3221137ae4a83">
   <xsd:schema xmlns:xsd="http://www.w3.org/2001/XMLSchema" xmlns:xs="http://www.w3.org/2001/XMLSchema" xmlns:p="http://schemas.microsoft.com/office/2006/metadata/properties" xmlns:ns2="3b482ed9-8516-4b08-969d-6de7c18a37f1" xmlns:ns3="a302d444-be9f-46f7-8d57-7fcd8dffb9f7" targetNamespace="http://schemas.microsoft.com/office/2006/metadata/properties" ma:root="true" ma:fieldsID="9b7fb6852766fbf3443e90d18e386398" ns2:_="" ns3:_="">
     <xsd:import namespace="3b482ed9-8516-4b08-969d-6de7c18a37f1"/>
@@ -8916,26 +8973,27 @@
 </ct:contentTypeSchema>
 </file>
 
-<file path=customXml/itemProps1.xml><?xml version="1.0" encoding="utf-8"?>
-<ds:datastoreItem xmlns:ds="http://schemas.openxmlformats.org/officeDocument/2006/customXml" ds:itemID="{0B5B0B91-61F6-41CF-8237-5357FE3F0223}">
-  <ds:schemaRefs>
-    <ds:schemaRef ds:uri="http://schemas.microsoft.com/office/2006/metadata/properties"/>
-    <ds:schemaRef ds:uri="http://schemas.microsoft.com/office/infopath/2007/PartnerControls"/>
-    <ds:schemaRef ds:uri="a302d444-be9f-46f7-8d57-7fcd8dffb9f7"/>
-    <ds:schemaRef ds:uri="3b482ed9-8516-4b08-969d-6de7c18a37f1"/>
-  </ds:schemaRefs>
-</ds:datastoreItem>
+<file path=customXml/item2.xml><?xml version="1.0" encoding="utf-8"?>
+<?mso-contentType ?>
+<FormTemplates xmlns="http://schemas.microsoft.com/sharepoint/v3/contenttype/forms">
+  <Display>DocumentLibraryForm</Display>
+  <Edit>DocumentLibraryForm</Edit>
+  <New>DocumentLibraryForm</New>
+</FormTemplates>
 </file>
 
-<file path=customXml/itemProps2.xml><?xml version="1.0" encoding="utf-8"?>
-<ds:datastoreItem xmlns:ds="http://schemas.openxmlformats.org/officeDocument/2006/customXml" ds:itemID="{8F6019E3-B2AB-458C-9CE0-D55AFBE67629}">
-  <ds:schemaRefs>
-    <ds:schemaRef ds:uri="http://schemas.microsoft.com/sharepoint/v3/contenttype/forms"/>
-  </ds:schemaRefs>
-</ds:datastoreItem>
+<file path=customXml/item3.xml><?xml version="1.0" encoding="utf-8"?>
+<p:properties xmlns:p="http://schemas.microsoft.com/office/2006/metadata/properties" xmlns:xsi="http://www.w3.org/2001/XMLSchema-instance" xmlns:pc="http://schemas.microsoft.com/office/infopath/2007/PartnerControls">
+  <documentManagement>
+    <TaxCatchAll xmlns="a302d444-be9f-46f7-8d57-7fcd8dffb9f7" xsi:nil="true"/>
+    <lcf76f155ced4ddcb4097134ff3c332f xmlns="3b482ed9-8516-4b08-969d-6de7c18a37f1">
+      <Terms xmlns="http://schemas.microsoft.com/office/infopath/2007/PartnerControls"/>
+    </lcf76f155ced4ddcb4097134ff3c332f>
+  </documentManagement>
+</p:properties>
 </file>
 
-<file path=customXml/itemProps3.xml><?xml version="1.0" encoding="utf-8"?>
+<file path=customXml/itemProps1.xml><?xml version="1.0" encoding="utf-8"?>
 <ds:datastoreItem xmlns:ds="http://schemas.openxmlformats.org/officeDocument/2006/customXml" ds:itemID="{27E92379-4415-4B95-B7D9-AF42F4120494}">
   <ds:schemaRefs>
     <ds:schemaRef ds:uri="http://schemas.microsoft.com/office/2006/metadata/contentType"/>
@@ -8952,4 +9010,23 @@
     <ds:schemaRef ds:uri="http://schemas.microsoft.com/internal/obd"/>
   </ds:schemaRefs>
 </ds:datastoreItem>
+</file>
+
+<file path=customXml/itemProps2.xml><?xml version="1.0" encoding="utf-8"?>
+<ds:datastoreItem xmlns:ds="http://schemas.openxmlformats.org/officeDocument/2006/customXml" ds:itemID="{8F6019E3-B2AB-458C-9CE0-D55AFBE67629}">
+  <ds:schemaRefs>
+    <ds:schemaRef ds:uri="http://schemas.microsoft.com/sharepoint/v3/contenttype/forms"/>
+  </ds:schemaRefs>
+</ds:datastoreItem>
+</file>
+
+<file path=customXml/itemProps3.xml><?xml version="1.0" encoding="utf-8"?>
+<ds:datastoreItem xmlns:ds="http://schemas.openxmlformats.org/officeDocument/2006/customXml" ds:itemID="{0B5B0B91-61F6-41CF-8237-5357FE3F0223}">
+  <ds:schemaRefs>
+    <ds:schemaRef ds:uri="http://schemas.microsoft.com/office/2006/metadata/properties"/>
+    <ds:schemaRef ds:uri="http://schemas.microsoft.com/office/infopath/2007/PartnerControls"/>
+    <ds:schemaRef ds:uri="a302d444-be9f-46f7-8d57-7fcd8dffb9f7"/>
+    <ds:schemaRef ds:uri="3b482ed9-8516-4b08-969d-6de7c18a37f1"/>
+  </ds:schemaRefs>
+</ds:datastoreItem>
 </file>
</xml_diff>